<commit_message>
feat: update professional experience and project details in portfolio
</commit_message>
<xml_diff>
--- a/public/OdayTarek.docx
+++ b/public/OdayTarek.docx
@@ -1,6 +1,6 @@
 
 <file path=word/document.xml><?xml version="1.0" encoding="utf-8"?>
-<w:document xmlns:wpc="http://schemas.microsoft.com/office/word/2010/wordprocessingCanvas" xmlns:cx="http://schemas.microsoft.com/office/drawing/2014/chartex" xmlns:cx1="http://schemas.microsoft.com/office/drawing/2015/9/8/chartex" xmlns:cx2="http://schemas.microsoft.com/office/drawing/2015/10/21/chartex" xmlns:cx3="http://schemas.microsoft.com/office/drawing/2016/5/9/chartex" xmlns:cx4="http://schemas.microsoft.com/office/drawing/2016/5/10/chartex" xmlns:cx5="http://schemas.microsoft.com/office/drawing/2016/5/11/chartex" xmlns:cx6="http://schemas.microsoft.com/office/drawing/2016/5/12/chartex" xmlns:cx7="http://schemas.microsoft.com/office/drawing/2016/5/13/chartex" xmlns:cx8="http://schemas.microsoft.com/office/drawing/2016/5/14/chartex" xmlns:mc="http://schemas.openxmlformats.org/markup-compatibility/2006" xmlns:aink="http://schemas.microsoft.com/office/drawing/2016/ink" xmlns:am3d="http://schemas.microsoft.com/office/drawing/2017/model3d" xmlns:o="urn:schemas-microsoft-com:office:office" xmlns:r="http://schemas.openxmlformats.org/officeDocument/2006/relationships" xmlns:m="http://schemas.openxmlformats.org/officeDocument/2006/math" xmlns:v="urn:schemas-microsoft-com:vml" xmlns:wp14="http://schemas.microsoft.com/office/word/2010/wordprocessingDrawing" xmlns:wp="http://schemas.openxmlformats.org/drawingml/2006/wordprocessingDrawing" xmlns:w10="urn:schemas-microsoft-com:office:word" xmlns:w="http://schemas.openxmlformats.org/wordprocessingml/2006/main" xmlns:w14="http://schemas.microsoft.com/office/word/2010/wordml" xmlns:w15="http://schemas.microsoft.com/office/word/2012/wordml" xmlns:w16cex="http://schemas.microsoft.com/office/word/2018/wordml/cex" xmlns:w16cid="http://schemas.microsoft.com/office/word/2016/wordml/cid" xmlns:w16="http://schemas.microsoft.com/office/word/2018/wordml" xmlns:w16sdtdh="http://schemas.microsoft.com/office/word/2020/wordml/sdtdatahash" xmlns:w16se="http://schemas.microsoft.com/office/word/2015/wordml/symex" xmlns:wpg="http://schemas.microsoft.com/office/word/2010/wordprocessingGroup" xmlns:wpi="http://schemas.microsoft.com/office/word/2010/wordprocessingInk" xmlns:wne="http://schemas.microsoft.com/office/word/2006/wordml" xmlns:wps="http://schemas.microsoft.com/office/word/2010/wordprocessingShape" mc:Ignorable="w14 w15 w16se w16cid w16 w16cex w16sdtdh wp14">
+<w:document xmlns:wpc="http://schemas.microsoft.com/office/word/2010/wordprocessingCanvas" xmlns:cx="http://schemas.microsoft.com/office/drawing/2014/chartex" xmlns:cx1="http://schemas.microsoft.com/office/drawing/2015/9/8/chartex" xmlns:cx2="http://schemas.microsoft.com/office/drawing/2015/10/21/chartex" xmlns:cx3="http://schemas.microsoft.com/office/drawing/2016/5/9/chartex" xmlns:cx4="http://schemas.microsoft.com/office/drawing/2016/5/10/chartex" xmlns:cx5="http://schemas.microsoft.com/office/drawing/2016/5/11/chartex" xmlns:cx6="http://schemas.microsoft.com/office/drawing/2016/5/12/chartex" xmlns:cx7="http://schemas.microsoft.com/office/drawing/2016/5/13/chartex" xmlns:cx8="http://schemas.microsoft.com/office/drawing/2016/5/14/chartex" xmlns:mc="http://schemas.openxmlformats.org/markup-compatibility/2006" xmlns:aink="http://schemas.microsoft.com/office/drawing/2016/ink" xmlns:am3d="http://schemas.microsoft.com/office/drawing/2017/model3d" xmlns:o="urn:schemas-microsoft-com:office:office" xmlns:oel="http://schemas.microsoft.com/office/2019/extlst" xmlns:r="http://schemas.openxmlformats.org/officeDocument/2006/relationships" xmlns:m="http://schemas.openxmlformats.org/officeDocument/2006/math" xmlns:v="urn:schemas-microsoft-com:vml" xmlns:wp14="http://schemas.microsoft.com/office/word/2010/wordprocessingDrawing" xmlns:wp="http://schemas.openxmlformats.org/drawingml/2006/wordprocessingDrawing" xmlns:w10="urn:schemas-microsoft-com:office:word" xmlns:w="http://schemas.openxmlformats.org/wordprocessingml/2006/main" xmlns:w14="http://schemas.microsoft.com/office/word/2010/wordml" xmlns:w15="http://schemas.microsoft.com/office/word/2012/wordml" xmlns:w16cex="http://schemas.microsoft.com/office/word/2018/wordml/cex" xmlns:w16cid="http://schemas.microsoft.com/office/word/2016/wordml/cid" xmlns:w16="http://schemas.microsoft.com/office/word/2018/wordml" xmlns:w16du="http://schemas.microsoft.com/office/word/2023/wordml/word16du" xmlns:w16sdtdh="http://schemas.microsoft.com/office/word/2020/wordml/sdtdatahash" xmlns:w16sdtfl="http://schemas.microsoft.com/office/word/2024/wordml/sdtformatlock" xmlns:w16se="http://schemas.microsoft.com/office/word/2015/wordml/symex" xmlns:wpg="http://schemas.microsoft.com/office/word/2010/wordprocessingGroup" xmlns:wpi="http://schemas.microsoft.com/office/word/2010/wordprocessingInk" xmlns:wne="http://schemas.microsoft.com/office/word/2006/wordml" xmlns:wps="http://schemas.microsoft.com/office/word/2010/wordprocessingShape" mc:Ignorable="w14 w15 w16se w16cid w16 w16cex w16sdtdh w16sdtfl w16du wp14">
   <w:body>
     <w:p>
       <w:pPr>
@@ -20,7 +20,7 @@
     </w:p>
     <w:p>
       <w:pPr>
-        <w:divId w:val="1392850925"/>
+        <w:divId w:val="2106685271"/>
         <w:rPr>
           <w:rFonts w:ascii="Calibri" w:eastAsia="Times New Roman" w:hAnsi="Calibri" w:cs="Calibri"/>
           <w:b/>
@@ -48,7 +48,7 @@
     </w:p>
     <w:p>
       <w:pPr>
-        <w:divId w:val="219482390"/>
+        <w:divId w:val="2117868967"/>
         <w:rPr>
           <w:rFonts w:ascii="Calibri" w:eastAsia="Times New Roman" w:hAnsi="Calibri" w:cs="Calibri"/>
           <w:color w:val="3E4C59"/>
@@ -152,7 +152,7 @@
     </w:p>
     <w:p>
       <w:pPr>
-        <w:divId w:val="255674518"/>
+        <w:divId w:val="360320661"/>
         <w:rPr>
           <w:rFonts w:ascii="Calibri" w:eastAsia="Times New Roman" w:hAnsi="Calibri" w:cs="Calibri"/>
           <w:color w:val="1F2933"/>
@@ -305,17 +305,7 @@
           <w:szCs w:val="19"/>
           <w:lang w:val="en"/>
         </w:rPr>
-        <w:t>Full-stack developer with 2+ years building cloud-native web applications across the JavaScript/TypeScript stack (React, Next.js, Vue, Node.js, NestJS). Specialized in eve</w:t>
-      </w:r>
-      <w:r>
-        <w:rPr>
-          <w:rFonts w:ascii="Calibri" w:hAnsi="Calibri" w:cs="Calibri"/>
-          <w:color w:val="1F2933"/>
-          <w:sz w:val="19"/>
-          <w:szCs w:val="19"/>
-          <w:lang w:val="en"/>
-        </w:rPr>
-        <w:t>nt-driven microservices with RabbitMQ and Kafka, GraphQL/REST API design, and GCP/AWS deployments using Docker, Kubernetes, and CI/CD. Cut API response times up to 40% through Redis caching and query optimization.</w:t>
+        <w:t>Full-stack developer with 2+ years building cloud-native web applications across the JavaScript/TypeScript stack (React, Next.js, Vue, Node.js, NestJS). Specialized in event-driven microservices with RabbitMQ and Kafka, GraphQL/REST API design, and GCP/AWS deployments using Docker, Kubernetes, and CI/CD. Cut API response times up to 40% through Redis caching and query optimization.</w:t>
       </w:r>
     </w:p>
     <w:p>
@@ -336,7 +326,7 @@
     </w:p>
     <w:p>
       <w:pPr>
-        <w:divId w:val="852694849"/>
+        <w:divId w:val="666781"/>
         <w:rPr>
           <w:rFonts w:ascii="Calibri" w:eastAsia="Times New Roman" w:hAnsi="Calibri" w:cs="Calibri"/>
           <w:color w:val="1F2933"/>
@@ -363,22 +353,12 @@
           <w:szCs w:val="19"/>
           <w:lang w:val="en"/>
         </w:rPr>
-        <w:t xml:space="preserve"> JavaScript, TypeScript, </w:t>
-      </w:r>
-      <w:r>
-        <w:rPr>
-          <w:rFonts w:ascii="Calibri" w:eastAsia="Times New Roman" w:hAnsi="Calibri" w:cs="Calibri"/>
-          <w:color w:val="1F2933"/>
-          <w:sz w:val="19"/>
-          <w:szCs w:val="19"/>
-          <w:lang w:val="en"/>
-        </w:rPr>
-        <w:t>Go (working knowledge)</w:t>
-      </w:r>
-    </w:p>
-    <w:p>
-      <w:pPr>
-        <w:divId w:val="737897050"/>
+        <w:t xml:space="preserve"> JavaScript, TypeScript, Go (working knowledge)</w:t>
+      </w:r>
+    </w:p>
+    <w:p>
+      <w:pPr>
+        <w:divId w:val="322010301"/>
         <w:rPr>
           <w:rFonts w:ascii="Calibri" w:eastAsia="Times New Roman" w:hAnsi="Calibri" w:cs="Calibri"/>
           <w:color w:val="1F2933"/>
@@ -405,12 +385,22 @@
           <w:szCs w:val="19"/>
           <w:lang w:val="en"/>
         </w:rPr>
-        <w:t xml:space="preserve"> React, Next.js, Vue, Nuxt, Redux, Tailwind CSS, TanStack</w:t>
-      </w:r>
-    </w:p>
-    <w:p>
-      <w:pPr>
-        <w:divId w:val="374357076"/>
+        <w:t xml:space="preserve"> </w:t>
+      </w:r>
+      <w:r>
+        <w:rPr>
+          <w:rFonts w:ascii="Calibri" w:eastAsia="Times New Roman" w:hAnsi="Calibri" w:cs="Calibri"/>
+          <w:color w:val="1F2933"/>
+          <w:sz w:val="19"/>
+          <w:szCs w:val="19"/>
+          <w:lang w:val="en"/>
+        </w:rPr>
+        <w:t>React, Next.js, Vue, Nuxt, Redux, Tailwind CSS, TanStack</w:t>
+      </w:r>
+    </w:p>
+    <w:p>
+      <w:pPr>
+        <w:divId w:val="2136828915"/>
         <w:rPr>
           <w:rFonts w:ascii="Calibri" w:eastAsia="Times New Roman" w:hAnsi="Calibri" w:cs="Calibri"/>
           <w:color w:val="1F2933"/>
@@ -442,7 +432,7 @@
     </w:p>
     <w:p>
       <w:pPr>
-        <w:divId w:val="2054111958"/>
+        <w:divId w:val="2039309649"/>
         <w:rPr>
           <w:rFonts w:ascii="Calibri" w:eastAsia="Times New Roman" w:hAnsi="Calibri" w:cs="Calibri"/>
           <w:color w:val="1F2933"/>
@@ -474,7 +464,7 @@
     </w:p>
     <w:p>
       <w:pPr>
-        <w:divId w:val="760759025"/>
+        <w:divId w:val="1991906828"/>
         <w:rPr>
           <w:rFonts w:ascii="Calibri" w:eastAsia="Times New Roman" w:hAnsi="Calibri" w:cs="Calibri"/>
           <w:color w:val="1F2933"/>
@@ -501,22 +491,12 @@
           <w:szCs w:val="19"/>
           <w:lang w:val="en"/>
         </w:rPr>
-        <w:t xml:space="preserve"> Google Cloud </w:t>
-      </w:r>
-      <w:r>
-        <w:rPr>
-          <w:rFonts w:ascii="Calibri" w:eastAsia="Times New Roman" w:hAnsi="Calibri" w:cs="Calibri"/>
-          <w:color w:val="1F2933"/>
-          <w:sz w:val="19"/>
-          <w:szCs w:val="19"/>
-          <w:lang w:val="en"/>
-        </w:rPr>
-        <w:t>Platform (GCP), AWS, Docker, Kubernetes, Nginx, CI/CD, Turborepo</w:t>
-      </w:r>
-    </w:p>
-    <w:p>
-      <w:pPr>
-        <w:divId w:val="834490297"/>
+        <w:t xml:space="preserve"> Google Cloud Platform (GCP), AWS, Docker, Kubernetes, Nginx, CI/CD, Turborepo</w:t>
+      </w:r>
+    </w:p>
+    <w:p>
+      <w:pPr>
+        <w:divId w:val="1477407143"/>
         <w:rPr>
           <w:rFonts w:ascii="Calibri" w:eastAsia="Times New Roman" w:hAnsi="Calibri" w:cs="Calibri"/>
           <w:color w:val="1F2933"/>
@@ -548,7 +528,7 @@
     </w:p>
     <w:p>
       <w:pPr>
-        <w:divId w:val="194125361"/>
+        <w:divId w:val="1210610357"/>
         <w:rPr>
           <w:rFonts w:ascii="Calibri" w:eastAsia="Times New Roman" w:hAnsi="Calibri" w:cs="Calibri"/>
           <w:color w:val="1F2933"/>
@@ -596,7 +576,7 @@
     </w:p>
     <w:p>
       <w:pPr>
-        <w:divId w:val="1030380889"/>
+        <w:divId w:val="920871238"/>
         <w:rPr>
           <w:rFonts w:ascii="Calibri" w:eastAsia="Times New Roman" w:hAnsi="Calibri" w:cs="Calibri"/>
           <w:color w:val="1F2933"/>
@@ -614,7 +594,7 @@
           <w:szCs w:val="20"/>
           <w:lang w:val="en"/>
         </w:rPr>
-        <w:t>Mantaray Digital Solutions</w:t>
+        <w:t>Circle360</w:t>
       </w:r>
       <w:r>
         <w:rPr>
@@ -622,15 +602,7 @@
           <w:rFonts w:ascii="Calibri" w:eastAsia="Times New Roman" w:hAnsi="Calibri" w:cs="Calibri"/>
           <w:lang w:val="en"/>
         </w:rPr>
-        <w:t xml:space="preserve"> — Full-Stack De</w:t>
-      </w:r>
-      <w:r>
-        <w:rPr>
-          <w:rStyle w:val="role1"/>
-          <w:rFonts w:ascii="Calibri" w:eastAsia="Times New Roman" w:hAnsi="Calibri" w:cs="Calibri"/>
-          <w:lang w:val="en"/>
-        </w:rPr>
-        <w:t>veloper</w:t>
+        <w:t xml:space="preserve"> — Full-Stack Developer</w:t>
       </w:r>
       <w:r>
         <w:rPr>
@@ -648,7 +620,7 @@
           <w:rFonts w:ascii="Calibri" w:eastAsia="Times New Roman" w:hAnsi="Calibri" w:cs="Calibri"/>
           <w:lang w:val="en"/>
         </w:rPr>
-        <w:t>Jun 2024 – Present</w:t>
+        <w:t>May 2026 – Present</w:t>
       </w:r>
       <w:r>
         <w:rPr>
@@ -668,157 +640,29 @@
           <w:numId w:val="1"/>
         </w:numPr>
         <w:spacing w:before="15" w:after="15"/>
-        <w:divId w:val="610092119"/>
-        <w:rPr>
-          <w:rFonts w:ascii="Calibri" w:eastAsia="Times New Roman" w:hAnsi="Calibri" w:cs="Calibri"/>
-          <w:color w:val="1F2933"/>
-          <w:sz w:val="19"/>
-          <w:szCs w:val="19"/>
-          <w:lang w:val="en"/>
-        </w:rPr>
-      </w:pPr>
-      <w:r>
-        <w:rPr>
-          <w:rFonts w:ascii="Calibri" w:eastAsia="Times New Roman" w:hAnsi="Calibri" w:cs="Calibri"/>
-          <w:color w:val="1F2933"/>
-          <w:sz w:val="19"/>
-          <w:szCs w:val="19"/>
-          <w:lang w:val="en"/>
-        </w:rPr>
-        <w:t>Shipped multiple full-stack products end-to-end — owning architecture, API design, and deployment — using NestJS, React/Next.js, RabbitMQ, and GCP.</w:t>
-      </w:r>
-    </w:p>
-    <w:p>
-      <w:pPr>
-        <w:numPr>
-          <w:ilvl w:val="0"/>
-          <w:numId w:val="1"/>
-        </w:numPr>
-        <w:spacing w:before="15" w:after="15"/>
-        <w:divId w:val="610092119"/>
-        <w:rPr>
-          <w:rFonts w:ascii="Calibri" w:eastAsia="Times New Roman" w:hAnsi="Calibri" w:cs="Calibri"/>
-          <w:color w:val="1F2933"/>
-          <w:sz w:val="19"/>
-          <w:szCs w:val="19"/>
-          <w:lang w:val="en"/>
-        </w:rPr>
-      </w:pPr>
-      <w:r>
-        <w:rPr>
-          <w:rFonts w:ascii="Calibri" w:eastAsia="Times New Roman" w:hAnsi="Calibri" w:cs="Calibri"/>
-          <w:color w:val="1F2933"/>
-          <w:sz w:val="19"/>
-          <w:szCs w:val="19"/>
-          <w:lang w:val="en"/>
-        </w:rPr>
-        <w:t>Designed resilient, event-driven microservices with RabbitMQ to power asynchronous workflows such as billing</w:t>
-      </w:r>
-      <w:r>
-        <w:rPr>
-          <w:rFonts w:ascii="Calibri" w:eastAsia="Times New Roman" w:hAnsi="Calibri" w:cs="Calibri"/>
-          <w:color w:val="1F2933"/>
-          <w:sz w:val="19"/>
-          <w:szCs w:val="19"/>
-          <w:lang w:val="en"/>
-        </w:rPr>
-        <w:t>, notifications, and real-time updates at scale.</w:t>
-      </w:r>
-    </w:p>
-    <w:p>
-      <w:pPr>
-        <w:numPr>
-          <w:ilvl w:val="0"/>
-          <w:numId w:val="1"/>
-        </w:numPr>
-        <w:spacing w:before="15" w:after="15"/>
-        <w:divId w:val="610092119"/>
-        <w:rPr>
-          <w:rFonts w:ascii="Calibri" w:eastAsia="Times New Roman" w:hAnsi="Calibri" w:cs="Calibri"/>
-          <w:color w:val="1F2933"/>
-          <w:sz w:val="19"/>
-          <w:szCs w:val="19"/>
-          <w:lang w:val="en"/>
-        </w:rPr>
-      </w:pPr>
-      <w:r>
-        <w:rPr>
-          <w:rFonts w:ascii="Calibri" w:eastAsia="Times New Roman" w:hAnsi="Calibri" w:cs="Calibri"/>
-          <w:color w:val="1F2933"/>
-          <w:sz w:val="19"/>
-          <w:szCs w:val="19"/>
-          <w:lang w:val="en"/>
-        </w:rPr>
-        <w:t>Deployed and managed containerized applications on GCP using Docker and Kubernetes for auto-scaling and high availability.</w:t>
-      </w:r>
-    </w:p>
-    <w:p>
-      <w:pPr>
-        <w:numPr>
-          <w:ilvl w:val="0"/>
-          <w:numId w:val="1"/>
-        </w:numPr>
-        <w:spacing w:before="15" w:after="15"/>
-        <w:divId w:val="610092119"/>
-        <w:rPr>
-          <w:rFonts w:ascii="Calibri" w:eastAsia="Times New Roman" w:hAnsi="Calibri" w:cs="Calibri"/>
-          <w:color w:val="1F2933"/>
-          <w:sz w:val="19"/>
-          <w:szCs w:val="19"/>
-          <w:lang w:val="en"/>
-        </w:rPr>
-      </w:pPr>
-      <w:r>
-        <w:rPr>
-          <w:rFonts w:ascii="Calibri" w:eastAsia="Times New Roman" w:hAnsi="Calibri" w:cs="Calibri"/>
-          <w:color w:val="1F2933"/>
-          <w:sz w:val="19"/>
-          <w:szCs w:val="19"/>
-          <w:lang w:val="en"/>
-        </w:rPr>
-        <w:t>Cut average API response time by introducing Redis caching and optimizing hot-path d</w:t>
-      </w:r>
-      <w:r>
-        <w:rPr>
-          <w:rFonts w:ascii="Calibri" w:eastAsia="Times New Roman" w:hAnsi="Calibri" w:cs="Calibri"/>
-          <w:color w:val="1F2933"/>
-          <w:sz w:val="19"/>
-          <w:szCs w:val="19"/>
-          <w:lang w:val="en"/>
-        </w:rPr>
-        <w:t>atabase queries.</w:t>
-      </w:r>
-    </w:p>
-    <w:p>
-      <w:pPr>
-        <w:numPr>
-          <w:ilvl w:val="0"/>
-          <w:numId w:val="1"/>
-        </w:numPr>
-        <w:spacing w:before="15" w:after="15"/>
-        <w:divId w:val="610092119"/>
-        <w:rPr>
-          <w:rFonts w:ascii="Calibri" w:eastAsia="Times New Roman" w:hAnsi="Calibri" w:cs="Calibri"/>
-          <w:color w:val="1F2933"/>
-          <w:sz w:val="19"/>
-          <w:szCs w:val="19"/>
-          <w:lang w:val="en"/>
-        </w:rPr>
-      </w:pPr>
-      <w:r>
-        <w:rPr>
-          <w:rFonts w:ascii="Calibri" w:eastAsia="Times New Roman" w:hAnsi="Calibri" w:cs="Calibri"/>
-          <w:color w:val="1F2933"/>
-          <w:sz w:val="19"/>
-          <w:szCs w:val="19"/>
-          <w:lang w:val="en"/>
-        </w:rPr>
-        <w:t>Implemented a Turborepo monorepo, Git Conventional Commits, and CI/CD pipelines, improving build times, collaboration, and release management.</w:t>
-      </w:r>
-    </w:p>
-    <w:p>
-      <w:pPr>
-        <w:divId w:val="1367485114"/>
+        <w:divId w:val="225066477"/>
+        <w:rPr>
+          <w:rFonts w:ascii="Calibri" w:eastAsia="Times New Roman" w:hAnsi="Calibri" w:cs="Calibri"/>
+          <w:color w:val="1F2933"/>
+          <w:sz w:val="19"/>
+          <w:szCs w:val="19"/>
+          <w:lang w:val="en"/>
+        </w:rPr>
+      </w:pPr>
+      <w:r>
+        <w:rPr>
+          <w:rFonts w:ascii="Calibri" w:eastAsia="Times New Roman" w:hAnsi="Calibri" w:cs="Calibri"/>
+          <w:color w:val="1F2933"/>
+          <w:sz w:val="19"/>
+          <w:szCs w:val="19"/>
+          <w:lang w:val="en"/>
+        </w:rPr>
+        <w:t>Angular micro-frontend platform work on large-scale digital transformation projects — custom software and secure system integration for regulated industries.</w:t>
+      </w:r>
+    </w:p>
+    <w:p>
+      <w:pPr>
+        <w:divId w:val="1473795313"/>
         <w:rPr>
           <w:rFonts w:ascii="Calibri" w:eastAsia="Times New Roman" w:hAnsi="Calibri" w:cs="Calibri"/>
           <w:color w:val="1F2933"/>
@@ -836,7 +680,7 @@
           <w:szCs w:val="20"/>
           <w:lang w:val="en"/>
         </w:rPr>
-        <w:t>Freelance (Concurrent)</w:t>
+        <w:t>Mantaray Digital Solutions</w:t>
       </w:r>
       <w:r>
         <w:rPr>
@@ -862,7 +706,7 @@
           <w:rFonts w:ascii="Calibri" w:eastAsia="Times New Roman" w:hAnsi="Calibri" w:cs="Calibri"/>
           <w:lang w:val="en"/>
         </w:rPr>
-        <w:t>2023 – Present</w:t>
+        <w:t>Jun 2024 – May 2026</w:t>
       </w:r>
       <w:r>
         <w:rPr>
@@ -882,34 +726,24 @@
           <w:numId w:val="2"/>
         </w:numPr>
         <w:spacing w:before="15" w:after="15"/>
-        <w:divId w:val="10760430"/>
-        <w:rPr>
-          <w:rFonts w:ascii="Calibri" w:eastAsia="Times New Roman" w:hAnsi="Calibri" w:cs="Calibri"/>
-          <w:color w:val="1F2933"/>
-          <w:sz w:val="19"/>
-          <w:szCs w:val="19"/>
-          <w:lang w:val="en"/>
-        </w:rPr>
-      </w:pPr>
-      <w:r>
-        <w:rPr>
-          <w:rFonts w:ascii="Calibri" w:eastAsia="Times New Roman" w:hAnsi="Calibri" w:cs="Calibri"/>
-          <w:color w:val="1F2933"/>
-          <w:sz w:val="19"/>
-          <w:szCs w:val="19"/>
-          <w:lang w:val="en"/>
-        </w:rPr>
-        <w:t>Built YallaMed, a multi-branch cli</w:t>
-      </w:r>
-      <w:r>
-        <w:rPr>
-          <w:rFonts w:ascii="Calibri" w:eastAsia="Times New Roman" w:hAnsi="Calibri" w:cs="Calibri"/>
-          <w:color w:val="1F2933"/>
-          <w:sz w:val="19"/>
-          <w:szCs w:val="19"/>
-          <w:lang w:val="en"/>
-        </w:rPr>
-        <w:t>nic management platform for the Egyptian healthcare market, using Vue, Express, MongoDB, and Socket.io.</w:t>
+        <w:divId w:val="90397243"/>
+        <w:rPr>
+          <w:rFonts w:ascii="Calibri" w:eastAsia="Times New Roman" w:hAnsi="Calibri" w:cs="Calibri"/>
+          <w:color w:val="1F2933"/>
+          <w:sz w:val="19"/>
+          <w:szCs w:val="19"/>
+          <w:lang w:val="en"/>
+        </w:rPr>
+      </w:pPr>
+      <w:r>
+        <w:rPr>
+          <w:rFonts w:ascii="Calibri" w:eastAsia="Times New Roman" w:hAnsi="Calibri" w:cs="Calibri"/>
+          <w:color w:val="1F2933"/>
+          <w:sz w:val="19"/>
+          <w:szCs w:val="19"/>
+          <w:lang w:val="en"/>
+        </w:rPr>
+        <w:t>Shipped multiple full-stack products end-to-end — owning architecture, API design, and deployment — using NestJS, React/Next.js, RabbitMQ, and GCP.</w:t>
       </w:r>
     </w:p>
     <w:p>
@@ -919,24 +753,24 @@
           <w:numId w:val="2"/>
         </w:numPr>
         <w:spacing w:before="15" w:after="15"/>
-        <w:divId w:val="10760430"/>
-        <w:rPr>
-          <w:rFonts w:ascii="Calibri" w:eastAsia="Times New Roman" w:hAnsi="Calibri" w:cs="Calibri"/>
-          <w:color w:val="1F2933"/>
-          <w:sz w:val="19"/>
-          <w:szCs w:val="19"/>
-          <w:lang w:val="en"/>
-        </w:rPr>
-      </w:pPr>
-      <w:r>
-        <w:rPr>
-          <w:rFonts w:ascii="Calibri" w:eastAsia="Times New Roman" w:hAnsi="Calibri" w:cs="Calibri"/>
-          <w:color w:val="1F2933"/>
-          <w:sz w:val="19"/>
-          <w:szCs w:val="19"/>
-          <w:lang w:val="en"/>
-        </w:rPr>
-        <w:t>Implemented coded clinical records (ICD-10 / LOINC), canvas prescriptions rendered to branded PDFs with Puppeteer, and a specialty MS disease registry.</w:t>
+        <w:divId w:val="90397243"/>
+        <w:rPr>
+          <w:rFonts w:ascii="Calibri" w:eastAsia="Times New Roman" w:hAnsi="Calibri" w:cs="Calibri"/>
+          <w:color w:val="1F2933"/>
+          <w:sz w:val="19"/>
+          <w:szCs w:val="19"/>
+          <w:lang w:val="en"/>
+        </w:rPr>
+      </w:pPr>
+      <w:r>
+        <w:rPr>
+          <w:rFonts w:ascii="Calibri" w:eastAsia="Times New Roman" w:hAnsi="Calibri" w:cs="Calibri"/>
+          <w:color w:val="1F2933"/>
+          <w:sz w:val="19"/>
+          <w:szCs w:val="19"/>
+          <w:lang w:val="en"/>
+        </w:rPr>
+        <w:t>Designed resilient, event-driven microservices with RabbitMQ to power asynchronous workflows such as billing, notifications, and real-time updates at scale.</w:t>
       </w:r>
     </w:p>
     <w:p>
@@ -946,76 +780,137 @@
           <w:numId w:val="2"/>
         </w:numPr>
         <w:spacing w:before="15" w:after="15"/>
-        <w:divId w:val="10760430"/>
-        <w:rPr>
-          <w:rFonts w:ascii="Calibri" w:eastAsia="Times New Roman" w:hAnsi="Calibri" w:cs="Calibri"/>
-          <w:color w:val="1F2933"/>
-          <w:sz w:val="19"/>
-          <w:szCs w:val="19"/>
-          <w:lang w:val="en"/>
-        </w:rPr>
-      </w:pPr>
-      <w:r>
-        <w:rPr>
-          <w:rFonts w:ascii="Calibri" w:eastAsia="Times New Roman" w:hAnsi="Calibri" w:cs="Calibri"/>
-          <w:color w:val="1F2933"/>
-          <w:sz w:val="19"/>
-          <w:szCs w:val="19"/>
-          <w:lang w:val="en"/>
-        </w:rPr>
-        <w:t>Developed booking and scheduling with online patient requests, inventory management, EGP billing, and granular team roles, with full Arabic (RTL) support and asset storage on AWS S3.</w:t>
-      </w:r>
-    </w:p>
-    <w:p>
-      <w:pPr>
-        <w:pStyle w:val="Heading2"/>
-        <w:rPr>
-          <w:rFonts w:ascii="Calibri" w:eastAsia="Times New Roman" w:hAnsi="Calibri" w:cs="Calibri"/>
-          <w:lang w:val="en"/>
-        </w:rPr>
-      </w:pPr>
-      <w:r>
-        <w:rPr>
-          <w:rFonts w:ascii="Calibri" w:eastAsia="Times New Roman" w:hAnsi="Calibri" w:cs="Calibri"/>
-          <w:lang w:val="en"/>
-        </w:rPr>
-        <w:t>Projects</w:t>
-      </w:r>
-    </w:p>
-    <w:p>
-      <w:pPr>
-        <w:divId w:val="532689266"/>
-        <w:rPr>
-          <w:rFonts w:ascii="Calibri" w:eastAsia="Times New Roman" w:hAnsi="Calibri" w:cs="Calibri"/>
-          <w:b/>
-          <w:bCs/>
+        <w:divId w:val="90397243"/>
+        <w:rPr>
+          <w:rFonts w:ascii="Calibri" w:eastAsia="Times New Roman" w:hAnsi="Calibri" w:cs="Calibri"/>
+          <w:color w:val="1F2933"/>
+          <w:sz w:val="19"/>
+          <w:szCs w:val="19"/>
+          <w:lang w:val="en"/>
+        </w:rPr>
+      </w:pPr>
+      <w:r>
+        <w:rPr>
+          <w:rFonts w:ascii="Calibri" w:eastAsia="Times New Roman" w:hAnsi="Calibri" w:cs="Calibri"/>
+          <w:color w:val="1F2933"/>
+          <w:sz w:val="19"/>
+          <w:szCs w:val="19"/>
+          <w:lang w:val="en"/>
+        </w:rPr>
+        <w:t>Deployed and managed containerized applications on GCP using Docker and Kubernetes for auto-scaling and high availability.</w:t>
+      </w:r>
+    </w:p>
+    <w:p>
+      <w:pPr>
+        <w:numPr>
+          <w:ilvl w:val="0"/>
+          <w:numId w:val="2"/>
+        </w:numPr>
+        <w:spacing w:before="15" w:after="15"/>
+        <w:divId w:val="90397243"/>
+        <w:rPr>
+          <w:rFonts w:ascii="Calibri" w:eastAsia="Times New Roman" w:hAnsi="Calibri" w:cs="Calibri"/>
+          <w:color w:val="1F2933"/>
+          <w:sz w:val="19"/>
+          <w:szCs w:val="19"/>
+          <w:lang w:val="en"/>
+        </w:rPr>
+      </w:pPr>
+      <w:r>
+        <w:rPr>
+          <w:rFonts w:ascii="Calibri" w:eastAsia="Times New Roman" w:hAnsi="Calibri" w:cs="Calibri"/>
+          <w:color w:val="1F2933"/>
+          <w:sz w:val="19"/>
+          <w:szCs w:val="19"/>
+          <w:lang w:val="en"/>
+        </w:rPr>
+        <w:t>Cut average API response time by introducing Redis caching and optimizing hot-path database queries.</w:t>
+      </w:r>
+    </w:p>
+    <w:p>
+      <w:pPr>
+        <w:numPr>
+          <w:ilvl w:val="0"/>
+          <w:numId w:val="2"/>
+        </w:numPr>
+        <w:spacing w:before="15" w:after="15"/>
+        <w:divId w:val="90397243"/>
+        <w:rPr>
+          <w:rFonts w:ascii="Calibri" w:eastAsia="Times New Roman" w:hAnsi="Calibri" w:cs="Calibri"/>
+          <w:color w:val="1F2933"/>
+          <w:sz w:val="19"/>
+          <w:szCs w:val="19"/>
+          <w:lang w:val="en"/>
+        </w:rPr>
+      </w:pPr>
+      <w:r>
+        <w:rPr>
+          <w:rFonts w:ascii="Calibri" w:eastAsia="Times New Roman" w:hAnsi="Calibri" w:cs="Calibri"/>
+          <w:color w:val="1F2933"/>
+          <w:sz w:val="19"/>
+          <w:szCs w:val="19"/>
+          <w:lang w:val="en"/>
+        </w:rPr>
+        <w:t>Implemented a Turborepo monorepo, Git Conventional Commits, and CI/CD pipelines, improving build times, collaboration, and release management.</w:t>
+      </w:r>
+    </w:p>
+    <w:p>
+      <w:pPr>
+        <w:divId w:val="562370232"/>
+        <w:rPr>
+          <w:rFonts w:ascii="Calibri" w:eastAsia="Times New Roman" w:hAnsi="Calibri" w:cs="Calibri"/>
+          <w:color w:val="1F2933"/>
+          <w:sz w:val="19"/>
+          <w:szCs w:val="19"/>
+          <w:lang w:val="en"/>
+        </w:rPr>
+      </w:pPr>
+      <w:r>
+        <w:rPr>
+          <w:rStyle w:val="company2"/>
+          <w:rFonts w:ascii="Calibri" w:eastAsia="Times New Roman" w:hAnsi="Calibri" w:cs="Calibri"/>
           <w:color w:val="243B53"/>
-          <w:sz w:val="19"/>
-          <w:szCs w:val="19"/>
-          <w:lang w:val="en"/>
-        </w:rPr>
-      </w:pPr>
-      <w:r>
-        <w:rPr>
-          <w:rFonts w:ascii="Calibri" w:eastAsia="Times New Roman" w:hAnsi="Calibri" w:cs="Calibri"/>
-          <w:b/>
-          <w:bCs/>
-          <w:color w:val="243B53"/>
-          <w:sz w:val="19"/>
-          <w:szCs w:val="19"/>
-          <w:lang w:val="en"/>
-        </w:rPr>
-        <w:t xml:space="preserve">Plato — All-in-One Restaurant Operations Platform </w:t>
-      </w:r>
-      <w:r>
-        <w:rPr>
-          <w:rStyle w:val="meta2"/>
-          <w:rFonts w:ascii="Calibri" w:eastAsia="Times New Roman" w:hAnsi="Calibri" w:cs="Calibri"/>
-          <w:sz w:val="19"/>
-          <w:szCs w:val="19"/>
-          <w:lang w:val="en"/>
-        </w:rPr>
-        <w:t>| Next.js, Convex, TypeScript, Tailwind CSS, Recharts | 2026</w:t>
+          <w:sz w:val="20"/>
+          <w:szCs w:val="20"/>
+          <w:lang w:val="en"/>
+        </w:rPr>
+        <w:t>Freelance (Concurrent)</w:t>
+      </w:r>
+      <w:r>
+        <w:rPr>
+          <w:rStyle w:val="role1"/>
+          <w:rFonts w:ascii="Calibri" w:eastAsia="Times New Roman" w:hAnsi="Calibri" w:cs="Calibri"/>
+          <w:lang w:val="en"/>
+        </w:rPr>
+        <w:t xml:space="preserve"> — Full-Stack Developer</w:t>
+      </w:r>
+      <w:r>
+        <w:rPr>
+          <w:rFonts w:ascii="Calibri" w:eastAsia="Times New Roman" w:hAnsi="Calibri" w:cs="Calibri"/>
+          <w:color w:val="1F2933"/>
+          <w:sz w:val="19"/>
+          <w:szCs w:val="19"/>
+          <w:lang w:val="en"/>
+        </w:rPr>
+        <w:t xml:space="preserve"> </w:t>
+      </w:r>
+      <w:r>
+        <w:rPr>
+          <w:rStyle w:val="dates1"/>
+          <w:rFonts w:ascii="Calibri" w:eastAsia="Times New Roman" w:hAnsi="Calibri" w:cs="Calibri"/>
+          <w:lang w:val="en"/>
+        </w:rPr>
+        <w:t>2023 – Present</w:t>
+      </w:r>
+      <w:r>
+        <w:rPr>
+          <w:rFonts w:ascii="Calibri" w:eastAsia="Times New Roman" w:hAnsi="Calibri" w:cs="Calibri"/>
+          <w:color w:val="1F2933"/>
+          <w:sz w:val="19"/>
+          <w:szCs w:val="19"/>
+          <w:lang w:val="en"/>
+        </w:rPr>
+        <w:t xml:space="preserve"> </w:t>
       </w:r>
     </w:p>
     <w:p>
@@ -1025,34 +920,24 @@
           <w:numId w:val="3"/>
         </w:numPr>
         <w:spacing w:before="15" w:after="15"/>
-        <w:divId w:val="24136807"/>
-        <w:rPr>
-          <w:rFonts w:ascii="Calibri" w:eastAsia="Times New Roman" w:hAnsi="Calibri" w:cs="Calibri"/>
-          <w:color w:val="1F2933"/>
-          <w:sz w:val="19"/>
-          <w:szCs w:val="19"/>
-          <w:lang w:val="en"/>
-        </w:rPr>
-      </w:pPr>
-      <w:r>
-        <w:rPr>
-          <w:rFonts w:ascii="Calibri" w:eastAsia="Times New Roman" w:hAnsi="Calibri" w:cs="Calibri"/>
-          <w:color w:val="1F2933"/>
-          <w:sz w:val="19"/>
-          <w:szCs w:val="19"/>
-          <w:lang w:val="en"/>
-        </w:rPr>
-        <w:t>Built a restaurant operations platform covering POS, kitchen display, inventory and recipe costing, finance/accounting, loyalty, payroll, and mul</w:t>
-      </w:r>
-      <w:r>
-        <w:rPr>
-          <w:rFonts w:ascii="Calibri" w:eastAsia="Times New Roman" w:hAnsi="Calibri" w:cs="Calibri"/>
-          <w:color w:val="1F2933"/>
-          <w:sz w:val="19"/>
-          <w:szCs w:val="19"/>
-          <w:lang w:val="en"/>
-        </w:rPr>
-        <w:t>ti-branch management, with AI menu-engineering insights and full Arabic (RTL) support.</w:t>
+        <w:divId w:val="1573075446"/>
+        <w:rPr>
+          <w:rFonts w:ascii="Calibri" w:eastAsia="Times New Roman" w:hAnsi="Calibri" w:cs="Calibri"/>
+          <w:color w:val="1F2933"/>
+          <w:sz w:val="19"/>
+          <w:szCs w:val="19"/>
+          <w:lang w:val="en"/>
+        </w:rPr>
+      </w:pPr>
+      <w:r>
+        <w:rPr>
+          <w:rFonts w:ascii="Calibri" w:eastAsia="Times New Roman" w:hAnsi="Calibri" w:cs="Calibri"/>
+          <w:color w:val="1F2933"/>
+          <w:sz w:val="19"/>
+          <w:szCs w:val="19"/>
+          <w:lang w:val="en"/>
+        </w:rPr>
+        <w:t>Built YallaMed, a multi-branch clinic management platform for the Egyptian healthcare market, using Vue, Express, MongoDB, and Socket.io.</w:t>
       </w:r>
     </w:p>
     <w:p>
@@ -1062,26 +947,220 @@
           <w:numId w:val="3"/>
         </w:numPr>
         <w:spacing w:before="15" w:after="15"/>
-        <w:divId w:val="24136807"/>
-        <w:rPr>
-          <w:rFonts w:ascii="Calibri" w:eastAsia="Times New Roman" w:hAnsi="Calibri" w:cs="Calibri"/>
-          <w:color w:val="1F2933"/>
-          <w:sz w:val="19"/>
-          <w:szCs w:val="19"/>
-          <w:lang w:val="en"/>
-        </w:rPr>
-      </w:pPr>
-      <w:r>
-        <w:rPr>
-          <w:rFonts w:ascii="Calibri" w:eastAsia="Times New Roman" w:hAnsi="Calibri" w:cs="Calibri"/>
-          <w:color w:val="1F2933"/>
-          <w:sz w:val="19"/>
-          <w:szCs w:val="19"/>
-          <w:lang w:val="en"/>
-        </w:rPr>
-        <w:t xml:space="preserve">Dashboard: </w:t>
+        <w:divId w:val="1573075446"/>
+        <w:rPr>
+          <w:rFonts w:ascii="Calibri" w:eastAsia="Times New Roman" w:hAnsi="Calibri" w:cs="Calibri"/>
+          <w:color w:val="1F2933"/>
+          <w:sz w:val="19"/>
+          <w:szCs w:val="19"/>
+          <w:lang w:val="en"/>
+        </w:rPr>
+      </w:pPr>
+      <w:r>
+        <w:rPr>
+          <w:rFonts w:ascii="Calibri" w:eastAsia="Times New Roman" w:hAnsi="Calibri" w:cs="Calibri"/>
+          <w:color w:val="1F2933"/>
+          <w:sz w:val="19"/>
+          <w:szCs w:val="19"/>
+          <w:lang w:val="en"/>
+        </w:rPr>
+        <w:t>Implemented coded clinical records (ICD-10 / LOINC), canvas prescriptions rendered to branded PDFs with Puppeteer, and a specialty MS disease registry.</w:t>
+      </w:r>
+    </w:p>
+    <w:p>
+      <w:pPr>
+        <w:numPr>
+          <w:ilvl w:val="0"/>
+          <w:numId w:val="3"/>
+        </w:numPr>
+        <w:spacing w:before="15" w:after="15"/>
+        <w:divId w:val="1573075446"/>
+        <w:rPr>
+          <w:rFonts w:ascii="Calibri" w:eastAsia="Times New Roman" w:hAnsi="Calibri" w:cs="Calibri"/>
+          <w:color w:val="1F2933"/>
+          <w:sz w:val="19"/>
+          <w:szCs w:val="19"/>
+          <w:lang w:val="en"/>
+        </w:rPr>
+      </w:pPr>
+      <w:r>
+        <w:rPr>
+          <w:rFonts w:ascii="Calibri" w:eastAsia="Times New Roman" w:hAnsi="Calibri" w:cs="Calibri"/>
+          <w:color w:val="1F2933"/>
+          <w:sz w:val="19"/>
+          <w:szCs w:val="19"/>
+          <w:lang w:val="en"/>
+        </w:rPr>
+        <w:t>Developed booking and scheduling with online patient requests, inventory management, EGP billing, and granular team roles, with full Arabic (RTL) support and asset storage on AWS S3.</w:t>
+      </w:r>
+    </w:p>
+    <w:p>
+      <w:pPr>
+        <w:numPr>
+          <w:ilvl w:val="0"/>
+          <w:numId w:val="3"/>
+        </w:numPr>
+        <w:spacing w:before="15" w:after="15"/>
+        <w:divId w:val="1573075446"/>
+        <w:rPr>
+          <w:rFonts w:ascii="Calibri" w:eastAsia="Times New Roman" w:hAnsi="Calibri" w:cs="Calibri"/>
+          <w:color w:val="1F2933"/>
+          <w:sz w:val="19"/>
+          <w:szCs w:val="19"/>
+          <w:lang w:val="en"/>
+        </w:rPr>
+      </w:pPr>
+      <w:r>
+        <w:rPr>
+          <w:rFonts w:ascii="Calibri" w:eastAsia="Times New Roman" w:hAnsi="Calibri" w:cs="Calibri"/>
+          <w:color w:val="1F2933"/>
+          <w:sz w:val="19"/>
+          <w:szCs w:val="19"/>
+          <w:lang w:val="en"/>
+        </w:rPr>
+        <w:t xml:space="preserve">Live: </w:t>
       </w:r>
       <w:hyperlink r:id="rId9" w:history="1">
+        <w:r>
+          <w:rPr>
+            <w:rStyle w:val="Hyperlink"/>
+            <w:rFonts w:ascii="Calibri" w:eastAsia="Times New Roman" w:hAnsi="Calibri" w:cs="Calibri"/>
+            <w:sz w:val="19"/>
+            <w:szCs w:val="19"/>
+            <w:lang w:val="en"/>
+          </w:rPr>
+          <w:t>yallamed.uk</w:t>
+        </w:r>
+      </w:hyperlink>
+    </w:p>
+    <w:p>
+      <w:pPr>
+        <w:pStyle w:val="Heading2"/>
+        <w:rPr>
+          <w:rFonts w:ascii="Calibri" w:eastAsia="Times New Roman" w:hAnsi="Calibri" w:cs="Calibri"/>
+          <w:lang w:val="en"/>
+        </w:rPr>
+      </w:pPr>
+      <w:r>
+        <w:rPr>
+          <w:rFonts w:ascii="Calibri" w:eastAsia="Times New Roman" w:hAnsi="Calibri" w:cs="Calibri"/>
+          <w:lang w:val="en"/>
+        </w:rPr>
+        <w:t>Projects</w:t>
+      </w:r>
+    </w:p>
+    <w:p>
+      <w:pPr>
+        <w:divId w:val="1020007317"/>
+        <w:rPr>
+          <w:rFonts w:ascii="Calibri" w:eastAsia="Times New Roman" w:hAnsi="Calibri" w:cs="Calibri"/>
+          <w:b/>
+          <w:bCs/>
+          <w:color w:val="243B53"/>
+          <w:sz w:val="19"/>
+          <w:szCs w:val="19"/>
+          <w:lang w:val="en"/>
+        </w:rPr>
+      </w:pPr>
+      <w:r>
+        <w:rPr>
+          <w:rFonts w:ascii="Calibri" w:eastAsia="Times New Roman" w:hAnsi="Calibri" w:cs="Calibri"/>
+          <w:b/>
+          <w:bCs/>
+          <w:color w:val="243B53"/>
+          <w:sz w:val="19"/>
+          <w:szCs w:val="19"/>
+          <w:lang w:val="en"/>
+        </w:rPr>
+        <w:t xml:space="preserve">Plato — All-in-One Restaurant Operations Platform </w:t>
+      </w:r>
+      <w:r>
+        <w:rPr>
+          <w:rStyle w:val="meta2"/>
+          <w:rFonts w:ascii="Calibri" w:eastAsia="Times New Roman" w:hAnsi="Calibri" w:cs="Calibri"/>
+          <w:sz w:val="19"/>
+          <w:szCs w:val="19"/>
+          <w:lang w:val="en"/>
+        </w:rPr>
+        <w:t>| Next.js, Convex, TypeScript, Tailwind CSS, Recharts | 2026</w:t>
+      </w:r>
+    </w:p>
+    <w:p>
+      <w:pPr>
+        <w:numPr>
+          <w:ilvl w:val="0"/>
+          <w:numId w:val="4"/>
+        </w:numPr>
+        <w:spacing w:before="15" w:after="15"/>
+        <w:divId w:val="1076517953"/>
+        <w:rPr>
+          <w:rFonts w:ascii="Calibri" w:eastAsia="Times New Roman" w:hAnsi="Calibri" w:cs="Calibri"/>
+          <w:color w:val="1F2933"/>
+          <w:sz w:val="19"/>
+          <w:szCs w:val="19"/>
+          <w:lang w:val="en"/>
+        </w:rPr>
+      </w:pPr>
+      <w:r>
+        <w:rPr>
+          <w:rFonts w:ascii="Calibri" w:eastAsia="Times New Roman" w:hAnsi="Calibri" w:cs="Calibri"/>
+          <w:color w:val="1F2933"/>
+          <w:sz w:val="19"/>
+          <w:szCs w:val="19"/>
+          <w:lang w:val="en"/>
+        </w:rPr>
+        <w:t>Built a restaurant operations platform covering POS, kitchen display, inventory and recipe costing, finance/accounting, loyalty, payroll, and multi-branch management, with AI menu-engineering insights and full Arabic (RTL) support.</w:t>
+      </w:r>
+    </w:p>
+    <w:p>
+      <w:pPr>
+        <w:numPr>
+          <w:ilvl w:val="0"/>
+          <w:numId w:val="4"/>
+        </w:numPr>
+        <w:spacing w:before="15" w:after="15"/>
+        <w:divId w:val="1076517953"/>
+        <w:rPr>
+          <w:rFonts w:ascii="Calibri" w:eastAsia="Times New Roman" w:hAnsi="Calibri" w:cs="Calibri"/>
+          <w:color w:val="1F2933"/>
+          <w:sz w:val="19"/>
+          <w:szCs w:val="19"/>
+          <w:lang w:val="en"/>
+        </w:rPr>
+      </w:pPr>
+      <w:r>
+        <w:rPr>
+          <w:rFonts w:ascii="Calibri" w:eastAsia="Times New Roman" w:hAnsi="Calibri" w:cs="Calibri"/>
+          <w:color w:val="1F2933"/>
+          <w:sz w:val="19"/>
+          <w:szCs w:val="19"/>
+          <w:lang w:val="en"/>
+        </w:rPr>
+        <w:t xml:space="preserve">Website: </w:t>
+      </w:r>
+      <w:hyperlink r:id="rId10" w:history="1">
+        <w:r>
+          <w:rPr>
+            <w:rStyle w:val="Hyperlink"/>
+            <w:rFonts w:ascii="Calibri" w:eastAsia="Times New Roman" w:hAnsi="Calibri" w:cs="Calibri"/>
+            <w:sz w:val="19"/>
+            <w:szCs w:val="19"/>
+            <w:lang w:val="en"/>
+          </w:rPr>
+          <w:t>useplato.net</w:t>
+        </w:r>
+      </w:hyperlink>
+      <w:r>
+        <w:rPr>
+          <w:rFonts w:ascii="Calibri" w:eastAsia="Times New Roman" w:hAnsi="Calibri" w:cs="Calibri"/>
+          <w:color w:val="1F2933"/>
+          <w:sz w:val="19"/>
+          <w:szCs w:val="19"/>
+          <w:lang w:val="en"/>
+        </w:rPr>
+        <w:t xml:space="preserve">  |  Dashboard: </w:t>
+      </w:r>
+      <w:hyperlink r:id="rId11" w:history="1">
         <w:r>
           <w:rPr>
             <w:rStyle w:val="Hyperlink"/>
@@ -1096,7 +1175,7 @@
     </w:p>
     <w:p>
       <w:pPr>
-        <w:divId w:val="922422481"/>
+        <w:divId w:val="1170947052"/>
         <w:rPr>
           <w:rFonts w:ascii="Calibri" w:eastAsia="Times New Roman" w:hAnsi="Calibri" w:cs="Calibri"/>
           <w:b/>
@@ -1127,131 +1206,7 @@
           <w:szCs w:val="19"/>
           <w:lang w:val="en"/>
         </w:rPr>
-        <w:t>| React, Next.js, NestJS, Socket.io</w:t>
-      </w:r>
-      <w:r>
-        <w:rPr>
-          <w:rStyle w:val="meta2"/>
-          <w:rFonts w:ascii="Calibri" w:eastAsia="Times New Roman" w:hAnsi="Calibri" w:cs="Calibri"/>
-          <w:sz w:val="19"/>
-          <w:szCs w:val="19"/>
-          <w:lang w:val="en"/>
-        </w:rPr>
-        <w:t>, PostgreSQL, Redis | 2025</w:t>
-      </w:r>
-    </w:p>
-    <w:p>
-      <w:pPr>
-        <w:numPr>
-          <w:ilvl w:val="0"/>
-          <w:numId w:val="4"/>
-        </w:numPr>
-        <w:spacing w:before="15" w:after="15"/>
-        <w:divId w:val="1795371119"/>
-        <w:rPr>
-          <w:rFonts w:ascii="Calibri" w:eastAsia="Times New Roman" w:hAnsi="Calibri" w:cs="Calibri"/>
-          <w:color w:val="1F2933"/>
-          <w:sz w:val="19"/>
-          <w:szCs w:val="19"/>
-          <w:lang w:val="en"/>
-        </w:rPr>
-      </w:pPr>
-      <w:r>
-        <w:rPr>
-          <w:rFonts w:ascii="Calibri" w:eastAsia="Times New Roman" w:hAnsi="Calibri" w:cs="Calibri"/>
-          <w:color w:val="1F2933"/>
-          <w:sz w:val="19"/>
-          <w:szCs w:val="19"/>
-          <w:lang w:val="en"/>
-        </w:rPr>
-        <w:t>Built a rental platform with guest booking and an owner dashboard for full property control; integrated Hostex payments and optimized API response times by 40%.</w:t>
-      </w:r>
-    </w:p>
-    <w:p>
-      <w:pPr>
-        <w:numPr>
-          <w:ilvl w:val="0"/>
-          <w:numId w:val="4"/>
-        </w:numPr>
-        <w:spacing w:before="15" w:after="15"/>
-        <w:divId w:val="1795371119"/>
-        <w:rPr>
-          <w:rFonts w:ascii="Calibri" w:eastAsia="Times New Roman" w:hAnsi="Calibri" w:cs="Calibri"/>
-          <w:color w:val="1F2933"/>
-          <w:sz w:val="19"/>
-          <w:szCs w:val="19"/>
-          <w:lang w:val="en"/>
-        </w:rPr>
-      </w:pPr>
-      <w:r>
-        <w:rPr>
-          <w:rFonts w:ascii="Calibri" w:eastAsia="Times New Roman" w:hAnsi="Calibri" w:cs="Calibri"/>
-          <w:color w:val="1F2933"/>
-          <w:sz w:val="19"/>
-          <w:szCs w:val="19"/>
-          <w:lang w:val="en"/>
-        </w:rPr>
-        <w:t xml:space="preserve">Live: </w:t>
-      </w:r>
-      <w:hyperlink r:id="rId10" w:history="1">
-        <w:r>
-          <w:rPr>
-            <w:rStyle w:val="Hyperlink"/>
-            <w:rFonts w:ascii="Calibri" w:eastAsia="Times New Roman" w:hAnsi="Calibri" w:cs="Calibri"/>
-            <w:sz w:val="19"/>
-            <w:szCs w:val="19"/>
-            <w:lang w:val="en"/>
-          </w:rPr>
-          <w:t>signaturestays.io</w:t>
-        </w:r>
-      </w:hyperlink>
-    </w:p>
-    <w:p>
-      <w:pPr>
-        <w:divId w:val="802387014"/>
-        <w:rPr>
-          <w:rFonts w:ascii="Calibri" w:eastAsia="Times New Roman" w:hAnsi="Calibri" w:cs="Calibri"/>
-          <w:b/>
-          <w:bCs/>
-          <w:color w:val="243B53"/>
-          <w:sz w:val="19"/>
-          <w:szCs w:val="19"/>
-          <w:lang w:val="en"/>
-        </w:rPr>
-      </w:pPr>
-      <w:r>
-        <w:rPr>
-          <w:rFonts w:ascii="Calibri" w:eastAsia="Times New Roman" w:hAnsi="Calibri" w:cs="Calibri"/>
-          <w:b/>
-          <w:bCs/>
-          <w:color w:val="243B53"/>
-          <w:sz w:val="19"/>
-          <w:szCs w:val="19"/>
-          <w:lang w:val="en"/>
-        </w:rPr>
-        <w:t>Y</w:t>
-      </w:r>
-      <w:r>
-        <w:rPr>
-          <w:rFonts w:ascii="Calibri" w:eastAsia="Times New Roman" w:hAnsi="Calibri" w:cs="Calibri"/>
-          <w:b/>
-          <w:bCs/>
-          <w:color w:val="243B53"/>
-          <w:sz w:val="19"/>
-          <w:szCs w:val="19"/>
-          <w:lang w:val="en"/>
-        </w:rPr>
-        <w:t xml:space="preserve">allapass — Studio Management Platform </w:t>
-      </w:r>
-      <w:r>
-        <w:rPr>
-          <w:rStyle w:val="meta2"/>
-          <w:rFonts w:ascii="Calibri" w:eastAsia="Times New Roman" w:hAnsi="Calibri" w:cs="Calibri"/>
-          <w:sz w:val="19"/>
-          <w:szCs w:val="19"/>
-          <w:lang w:val="en"/>
-        </w:rPr>
-        <w:t>| NestJS, Next.js, RabbitMQ, MongoDB, Socket.io, GCP, Docker | 2025</w:t>
+        <w:t>| React, Next.js, NestJS, Socket.io, PostgreSQL, Redis | 2025</w:t>
       </w:r>
     </w:p>
     <w:p>
@@ -1261,127 +1216,30 @@
           <w:numId w:val="5"/>
         </w:numPr>
         <w:spacing w:before="15" w:after="15"/>
-        <w:divId w:val="1161116058"/>
-        <w:rPr>
-          <w:rFonts w:ascii="Calibri" w:eastAsia="Times New Roman" w:hAnsi="Calibri" w:cs="Calibri"/>
-          <w:color w:val="1F2933"/>
-          <w:sz w:val="19"/>
-          <w:szCs w:val="19"/>
-          <w:lang w:val="en"/>
-        </w:rPr>
-      </w:pPr>
-      <w:r>
-        <w:rPr>
-          <w:rFonts w:ascii="Calibri" w:eastAsia="Times New Roman" w:hAnsi="Calibri" w:cs="Calibri"/>
-          <w:color w:val="1F2933"/>
-          <w:sz w:val="19"/>
-          <w:szCs w:val="19"/>
-          <w:lang w:val="en"/>
-        </w:rPr>
-        <w:t>Engineered a credit and subscription system with NestJS; integrated RabbitMQ for real-time email notifications and billing workflows.</w:t>
-      </w:r>
-    </w:p>
-    <w:p>
-      <w:pPr>
-        <w:numPr>
-          <w:ilvl w:val="0"/>
-          <w:numId w:val="5"/>
-        </w:numPr>
-        <w:spacing w:before="15" w:after="15"/>
-        <w:divId w:val="1161116058"/>
-        <w:rPr>
-          <w:rFonts w:ascii="Calibri" w:eastAsia="Times New Roman" w:hAnsi="Calibri" w:cs="Calibri"/>
-          <w:color w:val="1F2933"/>
-          <w:sz w:val="19"/>
-          <w:szCs w:val="19"/>
-          <w:lang w:val="en"/>
-        </w:rPr>
-      </w:pPr>
-      <w:r>
-        <w:rPr>
-          <w:rFonts w:ascii="Calibri" w:eastAsia="Times New Roman" w:hAnsi="Calibri" w:cs="Calibri"/>
-          <w:color w:val="1F2933"/>
-          <w:sz w:val="19"/>
-          <w:szCs w:val="19"/>
-          <w:lang w:val="en"/>
-        </w:rPr>
-        <w:t xml:space="preserve">Deployed on GCP </w:t>
-      </w:r>
-      <w:r>
-        <w:rPr>
-          <w:rFonts w:ascii="Calibri" w:eastAsia="Times New Roman" w:hAnsi="Calibri" w:cs="Calibri"/>
-          <w:color w:val="1F2933"/>
-          <w:sz w:val="19"/>
-          <w:szCs w:val="19"/>
-          <w:lang w:val="en"/>
-        </w:rPr>
-        <w:t>with Kubernetes auto-scaling to handle peak loads.</w:t>
-      </w:r>
-    </w:p>
-    <w:p>
-      <w:pPr>
-        <w:numPr>
-          <w:ilvl w:val="0"/>
-          <w:numId w:val="5"/>
-        </w:numPr>
-        <w:spacing w:before="15" w:after="15"/>
-        <w:divId w:val="1161116058"/>
-        <w:rPr>
-          <w:rFonts w:ascii="Calibri" w:eastAsia="Times New Roman" w:hAnsi="Calibri" w:cs="Calibri"/>
-          <w:color w:val="1F2933"/>
-          <w:sz w:val="19"/>
-          <w:szCs w:val="19"/>
-          <w:lang w:val="en"/>
-        </w:rPr>
-      </w:pPr>
-      <w:r>
-        <w:rPr>
-          <w:rFonts w:ascii="Calibri" w:eastAsia="Times New Roman" w:hAnsi="Calibri" w:cs="Calibri"/>
-          <w:color w:val="1F2933"/>
-          <w:sz w:val="19"/>
-          <w:szCs w:val="19"/>
-          <w:lang w:val="en"/>
-        </w:rPr>
-        <w:t xml:space="preserve">Demo: </w:t>
-      </w:r>
-      <w:hyperlink r:id="rId11" w:history="1">
-        <w:r>
-          <w:rPr>
-            <w:rStyle w:val="Hyperlink"/>
-            <w:rFonts w:ascii="Calibri" w:eastAsia="Times New Roman" w:hAnsi="Calibri" w:cs="Calibri"/>
-            <w:sz w:val="19"/>
-            <w:szCs w:val="19"/>
-            <w:lang w:val="en"/>
-          </w:rPr>
-          <w:t>API</w:t>
-        </w:r>
-      </w:hyperlink>
-      <w:r>
-        <w:rPr>
-          <w:rFonts w:ascii="Calibri" w:eastAsia="Times New Roman" w:hAnsi="Calibri" w:cs="Calibri"/>
-          <w:color w:val="1F2933"/>
-          <w:sz w:val="19"/>
-          <w:szCs w:val="19"/>
-          <w:lang w:val="en"/>
-        </w:rPr>
-        <w:t xml:space="preserve">  |  </w:t>
-      </w:r>
-      <w:hyperlink r:id="rId12" w:history="1">
-        <w:r>
-          <w:rPr>
-            <w:rStyle w:val="Hyperlink"/>
-            <w:rFonts w:ascii="Calibri" w:eastAsia="Times New Roman" w:hAnsi="Calibri" w:cs="Calibri"/>
-            <w:sz w:val="19"/>
-            <w:szCs w:val="19"/>
-            <w:lang w:val="en"/>
-          </w:rPr>
-          <w:t>Dashboard</w:t>
-        </w:r>
-      </w:hyperlink>
-    </w:p>
-    <w:p>
-      <w:pPr>
-        <w:divId w:val="1374425976"/>
+        <w:divId w:val="2112580895"/>
+        <w:rPr>
+          <w:rFonts w:ascii="Calibri" w:eastAsia="Times New Roman" w:hAnsi="Calibri" w:cs="Calibri"/>
+          <w:color w:val="1F2933"/>
+          <w:sz w:val="19"/>
+          <w:szCs w:val="19"/>
+          <w:lang w:val="en"/>
+        </w:rPr>
+      </w:pPr>
+      <w:r>
+        <w:rPr>
+          <w:rFonts w:ascii="Calibri" w:eastAsia="Times New Roman" w:hAnsi="Calibri" w:cs="Calibri"/>
+          <w:color w:val="1F2933"/>
+          <w:sz w:val="19"/>
+          <w:szCs w:val="19"/>
+          <w:lang w:val="en"/>
+        </w:rPr>
+        <w:lastRenderedPageBreak/>
+        <w:t>Built a rental platform with guest booking and an owner dashboard for full property control; integrated Hostex payments and optimized API response times by 40%.</w:t>
+      </w:r>
+    </w:p>
+    <w:p>
+      <w:pPr>
+        <w:divId w:val="1687558698"/>
         <w:rPr>
           <w:rFonts w:ascii="Calibri" w:eastAsia="Times New Roman" w:hAnsi="Calibri" w:cs="Calibri"/>
           <w:b/>
@@ -1402,7 +1260,7 @@
           <w:szCs w:val="19"/>
           <w:lang w:val="en"/>
         </w:rPr>
-        <w:t xml:space="preserve">Money Manager — Personal Finance App (Backend Developer) </w:t>
+        <w:t xml:space="preserve">Yallapass — Studio Management Platform </w:t>
       </w:r>
       <w:r>
         <w:rPr>
@@ -1412,7 +1270,7 @@
           <w:szCs w:val="19"/>
           <w:lang w:val="en"/>
         </w:rPr>
-        <w:t>| NestJS, PostgreSQL, TypeORM, RabbitMQ, Socket.io, GCP, Docker | 2025</w:t>
+        <w:t>| NestJS, Next.js, RabbitMQ, MongoDB, Socket.io, GCP, Docker | 2025</w:t>
       </w:r>
     </w:p>
     <w:p>
@@ -1422,34 +1280,24 @@
           <w:numId w:val="6"/>
         </w:numPr>
         <w:spacing w:before="15" w:after="15"/>
-        <w:divId w:val="2101831576"/>
-        <w:rPr>
-          <w:rFonts w:ascii="Calibri" w:eastAsia="Times New Roman" w:hAnsi="Calibri" w:cs="Calibri"/>
-          <w:color w:val="1F2933"/>
-          <w:sz w:val="19"/>
-          <w:szCs w:val="19"/>
-          <w:lang w:val="en"/>
-        </w:rPr>
-      </w:pPr>
-      <w:r>
-        <w:rPr>
-          <w:rFonts w:ascii="Calibri" w:eastAsia="Times New Roman" w:hAnsi="Calibri" w:cs="Calibri"/>
-          <w:color w:val="1F2933"/>
-          <w:sz w:val="19"/>
-          <w:szCs w:val="19"/>
-          <w:lang w:val="en"/>
-        </w:rPr>
-        <w:t>Built a finance tracker for managing expenses, setting budgets, and visualizing spending patterns through charts and reports, wi</w:t>
-      </w:r>
-      <w:r>
-        <w:rPr>
-          <w:rFonts w:ascii="Calibri" w:eastAsia="Times New Roman" w:hAnsi="Calibri" w:cs="Calibri"/>
-          <w:color w:val="1F2933"/>
-          <w:sz w:val="19"/>
-          <w:szCs w:val="19"/>
-          <w:lang w:val="en"/>
-        </w:rPr>
-        <w:t>th real-time updates via Socket.io.</w:t>
+        <w:divId w:val="267548126"/>
+        <w:rPr>
+          <w:rFonts w:ascii="Calibri" w:eastAsia="Times New Roman" w:hAnsi="Calibri" w:cs="Calibri"/>
+          <w:color w:val="1F2933"/>
+          <w:sz w:val="19"/>
+          <w:szCs w:val="19"/>
+          <w:lang w:val="en"/>
+        </w:rPr>
+      </w:pPr>
+      <w:r>
+        <w:rPr>
+          <w:rFonts w:ascii="Calibri" w:eastAsia="Times New Roman" w:hAnsi="Calibri" w:cs="Calibri"/>
+          <w:color w:val="1F2933"/>
+          <w:sz w:val="19"/>
+          <w:szCs w:val="19"/>
+          <w:lang w:val="en"/>
+        </w:rPr>
+        <w:t>Engineered a credit and subscription system with NestJS; integrated RabbitMQ for real-time email notifications and billing workflows.</w:t>
       </w:r>
     </w:p>
     <w:p>
@@ -1459,41 +1307,29 @@
           <w:numId w:val="6"/>
         </w:numPr>
         <w:spacing w:before="15" w:after="15"/>
-        <w:divId w:val="2101831576"/>
-        <w:rPr>
-          <w:rFonts w:ascii="Calibri" w:eastAsia="Times New Roman" w:hAnsi="Calibri" w:cs="Calibri"/>
-          <w:color w:val="1F2933"/>
-          <w:sz w:val="19"/>
-          <w:szCs w:val="19"/>
-          <w:lang w:val="en"/>
-        </w:rPr>
-      </w:pPr>
-      <w:r>
-        <w:rPr>
-          <w:rFonts w:ascii="Calibri" w:eastAsia="Times New Roman" w:hAnsi="Calibri" w:cs="Calibri"/>
-          <w:color w:val="1F2933"/>
-          <w:sz w:val="19"/>
-          <w:szCs w:val="19"/>
-          <w:lang w:val="en"/>
-        </w:rPr>
-        <w:t xml:space="preserve">API Demo: </w:t>
-      </w:r>
-      <w:hyperlink r:id="rId13" w:history="1">
-        <w:r>
-          <w:rPr>
-            <w:rStyle w:val="Hyperlink"/>
-            <w:rFonts w:ascii="Calibri" w:eastAsia="Times New Roman" w:hAnsi="Calibri" w:cs="Calibri"/>
-            <w:sz w:val="19"/>
-            <w:szCs w:val="19"/>
-            <w:lang w:val="en"/>
-          </w:rPr>
-          <w:t>Live API</w:t>
-        </w:r>
-      </w:hyperlink>
-    </w:p>
-    <w:p>
-      <w:pPr>
-        <w:divId w:val="1342661264"/>
+        <w:divId w:val="267548126"/>
+        <w:rPr>
+          <w:rFonts w:ascii="Calibri" w:eastAsia="Times New Roman" w:hAnsi="Calibri" w:cs="Calibri"/>
+          <w:color w:val="1F2933"/>
+          <w:sz w:val="19"/>
+          <w:szCs w:val="19"/>
+          <w:lang w:val="en"/>
+        </w:rPr>
+      </w:pPr>
+      <w:r>
+        <w:rPr>
+          <w:rFonts w:ascii="Calibri" w:eastAsia="Times New Roman" w:hAnsi="Calibri" w:cs="Calibri"/>
+          <w:color w:val="1F2933"/>
+          <w:sz w:val="19"/>
+          <w:szCs w:val="19"/>
+          <w:lang w:val="en"/>
+        </w:rPr>
+        <w:t>Deployed on GCP with Kubernetes auto-scaling to handle peak loads.</w:t>
+      </w:r>
+    </w:p>
+    <w:p>
+      <w:pPr>
+        <w:divId w:val="1770345344"/>
         <w:rPr>
           <w:rFonts w:ascii="Calibri" w:eastAsia="Times New Roman" w:hAnsi="Calibri" w:cs="Calibri"/>
           <w:b/>
@@ -1514,7 +1350,7 @@
           <w:szCs w:val="19"/>
           <w:lang w:val="en"/>
         </w:rPr>
-        <w:t xml:space="preserve">Online Learning Platform </w:t>
+        <w:t xml:space="preserve">Money Manager — Personal Finance App (Backend Developer) </w:t>
       </w:r>
       <w:r>
         <w:rPr>
@@ -1524,7 +1360,7 @@
           <w:szCs w:val="19"/>
           <w:lang w:val="en"/>
         </w:rPr>
-        <w:t>| NestJS, MongoDB, Paymob | 2024</w:t>
+        <w:t>| NestJS, PostgreSQL, TypeORM, RabbitMQ, Socket.io, GCP, Docker | 2025</w:t>
       </w:r>
     </w:p>
     <w:p>
@@ -1534,34 +1370,97 @@
           <w:numId w:val="7"/>
         </w:numPr>
         <w:spacing w:before="15" w:after="15"/>
-        <w:divId w:val="1611156958"/>
-        <w:rPr>
-          <w:rFonts w:ascii="Calibri" w:eastAsia="Times New Roman" w:hAnsi="Calibri" w:cs="Calibri"/>
-          <w:color w:val="1F2933"/>
-          <w:sz w:val="19"/>
-          <w:szCs w:val="19"/>
-          <w:lang w:val="en"/>
-        </w:rPr>
-      </w:pPr>
-      <w:r>
-        <w:rPr>
-          <w:rFonts w:ascii="Calibri" w:eastAsia="Times New Roman" w:hAnsi="Calibri" w:cs="Calibri"/>
-          <w:color w:val="1F2933"/>
-          <w:sz w:val="19"/>
-          <w:szCs w:val="19"/>
-          <w:lang w:val="en"/>
-        </w:rPr>
-        <w:t>Implemented JWT authentication and integrated Paymob for online course payments.</w:t>
+        <w:divId w:val="611127373"/>
+        <w:rPr>
+          <w:rFonts w:ascii="Calibri" w:eastAsia="Times New Roman" w:hAnsi="Calibri" w:cs="Calibri"/>
+          <w:color w:val="1F2933"/>
+          <w:sz w:val="19"/>
+          <w:szCs w:val="19"/>
+          <w:lang w:val="en"/>
+        </w:rPr>
+      </w:pPr>
+      <w:r>
+        <w:rPr>
+          <w:rFonts w:ascii="Calibri" w:eastAsia="Times New Roman" w:hAnsi="Calibri" w:cs="Calibri"/>
+          <w:color w:val="1F2933"/>
+          <w:sz w:val="19"/>
+          <w:szCs w:val="19"/>
+          <w:lang w:val="en"/>
+        </w:rPr>
+        <w:t>Built a finance tracker for managing expenses, setting budgets, and visualizing spending patterns through charts and reports, with real-time updates via Socket.io.</w:t>
+      </w:r>
+    </w:p>
+    <w:p>
+      <w:pPr>
+        <w:divId w:val="1868640200"/>
+        <w:rPr>
+          <w:rFonts w:ascii="Calibri" w:eastAsia="Times New Roman" w:hAnsi="Calibri" w:cs="Calibri"/>
+          <w:b/>
+          <w:bCs/>
+          <w:color w:val="243B53"/>
+          <w:sz w:val="19"/>
+          <w:szCs w:val="19"/>
+          <w:lang w:val="en"/>
+        </w:rPr>
+      </w:pPr>
+      <w:r>
+        <w:rPr>
+          <w:rFonts w:ascii="Calibri" w:eastAsia="Times New Roman" w:hAnsi="Calibri" w:cs="Calibri"/>
+          <w:b/>
+          <w:bCs/>
+          <w:color w:val="243B53"/>
+          <w:sz w:val="19"/>
+          <w:szCs w:val="19"/>
+          <w:lang w:val="en"/>
+        </w:rPr>
+        <w:t xml:space="preserve">Online Learning Platform </w:t>
+      </w:r>
+      <w:r>
+        <w:rPr>
+          <w:rStyle w:val="meta2"/>
+          <w:rFonts w:ascii="Calibri" w:eastAsia="Times New Roman" w:hAnsi="Calibri" w:cs="Calibri"/>
+          <w:sz w:val="19"/>
+          <w:szCs w:val="19"/>
+          <w:lang w:val="en"/>
+        </w:rPr>
+        <w:t>| NestJS, MongoDB, Paymob | 2024</w:t>
       </w:r>
     </w:p>
     <w:p>
       <w:pPr>
         <w:numPr>
           <w:ilvl w:val="0"/>
-          <w:numId w:val="7"/>
+          <w:numId w:val="8"/>
         </w:numPr>
         <w:spacing w:before="15" w:after="15"/>
-        <w:divId w:val="1611156958"/>
+        <w:divId w:val="1618870409"/>
+        <w:rPr>
+          <w:rFonts w:ascii="Calibri" w:eastAsia="Times New Roman" w:hAnsi="Calibri" w:cs="Calibri"/>
+          <w:color w:val="1F2933"/>
+          <w:sz w:val="19"/>
+          <w:szCs w:val="19"/>
+          <w:lang w:val="en"/>
+        </w:rPr>
+      </w:pPr>
+      <w:r>
+        <w:rPr>
+          <w:rFonts w:ascii="Calibri" w:eastAsia="Times New Roman" w:hAnsi="Calibri" w:cs="Calibri"/>
+          <w:color w:val="1F2933"/>
+          <w:sz w:val="19"/>
+          <w:szCs w:val="19"/>
+          <w:lang w:val="en"/>
+        </w:rPr>
+        <w:t>Implemented JWT authentication and integrated Paymob for online course payments.</w:t>
+      </w:r>
+    </w:p>
+    <w:p>
+      <w:pPr>
+        <w:numPr>
+          <w:ilvl w:val="0"/>
+          <w:numId w:val="8"/>
+        </w:numPr>
+        <w:spacing w:before="15" w:after="15"/>
+        <w:divId w:val="1618870409"/>
         <w:rPr>
           <w:rFonts w:ascii="Calibri" w:eastAsia="Times New Roman" w:hAnsi="Calibri" w:cs="Calibri"/>
           <w:color w:val="1F2933"/>
@@ -1580,7 +1479,7 @@
         </w:rPr>
         <w:t xml:space="preserve">GitHub: </w:t>
       </w:r>
-      <w:hyperlink r:id="rId14" w:history="1">
+      <w:hyperlink r:id="rId12" w:history="1">
         <w:r>
           <w:rPr>
             <w:rStyle w:val="Hyperlink"/>
@@ -1611,7 +1510,7 @@
     </w:p>
     <w:p>
       <w:pPr>
-        <w:divId w:val="1803496658"/>
+        <w:divId w:val="354354429"/>
         <w:rPr>
           <w:rFonts w:ascii="Calibri" w:eastAsia="Times New Roman" w:hAnsi="Calibri" w:cs="Calibri"/>
           <w:color w:val="1F2933"/>
@@ -1703,17 +1602,7 @@
           <w:szCs w:val="19"/>
           <w:lang w:val="en"/>
         </w:rPr>
-        <w:t xml:space="preserve">Arabic: Native   |   </w:t>
-      </w:r>
-      <w:r>
-        <w:rPr>
-          <w:rFonts w:ascii="Calibri" w:hAnsi="Calibri" w:cs="Calibri"/>
-          <w:color w:val="1F2933"/>
-          <w:sz w:val="19"/>
-          <w:szCs w:val="19"/>
-          <w:lang w:val="en"/>
-        </w:rPr>
-        <w:t>English: Professional Proficiency</w:t>
+        <w:t>Arabic: Native   |   English: Professional Proficiency</w:t>
       </w:r>
     </w:p>
     <w:sectPr>
@@ -1727,11 +1616,11 @@
 </file>
 
 <file path=word/numbering.xml><?xml version="1.0" encoding="utf-8"?>
-<w:numbering xmlns:wpc="http://schemas.microsoft.com/office/word/2010/wordprocessingCanvas" xmlns:cx="http://schemas.microsoft.com/office/drawing/2014/chartex" xmlns:cx1="http://schemas.microsoft.com/office/drawing/2015/9/8/chartex" xmlns:cx2="http://schemas.microsoft.com/office/drawing/2015/10/21/chartex" xmlns:cx3="http://schemas.microsoft.com/office/drawing/2016/5/9/chartex" xmlns:cx4="http://schemas.microsoft.com/office/drawing/2016/5/10/chartex" xmlns:cx5="http://schemas.microsoft.com/office/drawing/2016/5/11/chartex" xmlns:cx6="http://schemas.microsoft.com/office/drawing/2016/5/12/chartex" xmlns:cx7="http://schemas.microsoft.com/office/drawing/2016/5/13/chartex" xmlns:cx8="http://schemas.microsoft.com/office/drawing/2016/5/14/chartex" xmlns:mc="http://schemas.openxmlformats.org/markup-compatibility/2006" xmlns:aink="http://schemas.microsoft.com/office/drawing/2016/ink" xmlns:am3d="http://schemas.microsoft.com/office/drawing/2017/model3d" xmlns:o="urn:schemas-microsoft-com:office:office" xmlns:r="http://schemas.openxmlformats.org/officeDocument/2006/relationships" xmlns:m="http://schemas.openxmlformats.org/officeDocument/2006/math" xmlns:v="urn:schemas-microsoft-com:vml" xmlns:wp14="http://schemas.microsoft.com/office/word/2010/wordprocessingDrawing" xmlns:wp="http://schemas.openxmlformats.org/drawingml/2006/wordprocessingDrawing" xmlns:w10="urn:schemas-microsoft-com:office:word" xmlns:w="http://schemas.openxmlformats.org/wordprocessingml/2006/main" xmlns:w14="http://schemas.microsoft.com/office/word/2010/wordml" xmlns:w15="http://schemas.microsoft.com/office/word/2012/wordml" xmlns:w16cex="http://schemas.microsoft.com/office/word/2018/wordml/cex" xmlns:w16cid="http://schemas.microsoft.com/office/word/2016/wordml/cid" xmlns:w16="http://schemas.microsoft.com/office/word/2018/wordml" xmlns:w16sdtdh="http://schemas.microsoft.com/office/word/2020/wordml/sdtdatahash" xmlns:w16se="http://schemas.microsoft.com/office/word/2015/wordml/symex" xmlns:wpg="http://schemas.microsoft.com/office/word/2010/wordprocessingGroup" xmlns:wpi="http://schemas.microsoft.com/office/word/2010/wordprocessingInk" xmlns:wne="http://schemas.microsoft.com/office/word/2006/wordml" xmlns:wps="http://schemas.microsoft.com/office/word/2010/wordprocessingShape" mc:Ignorable="w14 w15 w16se w16cid w16 w16cex w16sdtdh wp14">
+<w:numbering xmlns:wpc="http://schemas.microsoft.com/office/word/2010/wordprocessingCanvas" xmlns:cx="http://schemas.microsoft.com/office/drawing/2014/chartex" xmlns:cx1="http://schemas.microsoft.com/office/drawing/2015/9/8/chartex" xmlns:cx2="http://schemas.microsoft.com/office/drawing/2015/10/21/chartex" xmlns:cx3="http://schemas.microsoft.com/office/drawing/2016/5/9/chartex" xmlns:cx4="http://schemas.microsoft.com/office/drawing/2016/5/10/chartex" xmlns:cx5="http://schemas.microsoft.com/office/drawing/2016/5/11/chartex" xmlns:cx6="http://schemas.microsoft.com/office/drawing/2016/5/12/chartex" xmlns:cx7="http://schemas.microsoft.com/office/drawing/2016/5/13/chartex" xmlns:cx8="http://schemas.microsoft.com/office/drawing/2016/5/14/chartex" xmlns:mc="http://schemas.openxmlformats.org/markup-compatibility/2006" xmlns:aink="http://schemas.microsoft.com/office/drawing/2016/ink" xmlns:am3d="http://schemas.microsoft.com/office/drawing/2017/model3d" xmlns:o="urn:schemas-microsoft-com:office:office" xmlns:oel="http://schemas.microsoft.com/office/2019/extlst" xmlns:r="http://schemas.openxmlformats.org/officeDocument/2006/relationships" xmlns:m="http://schemas.openxmlformats.org/officeDocument/2006/math" xmlns:v="urn:schemas-microsoft-com:vml" xmlns:wp14="http://schemas.microsoft.com/office/word/2010/wordprocessingDrawing" xmlns:wp="http://schemas.openxmlformats.org/drawingml/2006/wordprocessingDrawing" xmlns:w10="urn:schemas-microsoft-com:office:word" xmlns:w="http://schemas.openxmlformats.org/wordprocessingml/2006/main" xmlns:w14="http://schemas.microsoft.com/office/word/2010/wordml" xmlns:w15="http://schemas.microsoft.com/office/word/2012/wordml" xmlns:w16cex="http://schemas.microsoft.com/office/word/2018/wordml/cex" xmlns:w16cid="http://schemas.microsoft.com/office/word/2016/wordml/cid" xmlns:w16="http://schemas.microsoft.com/office/word/2018/wordml" xmlns:w16du="http://schemas.microsoft.com/office/word/2023/wordml/word16du" xmlns:w16sdtdh="http://schemas.microsoft.com/office/word/2020/wordml/sdtdatahash" xmlns:w16sdtfl="http://schemas.microsoft.com/office/word/2024/wordml/sdtformatlock" xmlns:w16se="http://schemas.microsoft.com/office/word/2015/wordml/symex" xmlns:wpg="http://schemas.microsoft.com/office/word/2010/wordprocessingGroup" xmlns:wpi="http://schemas.microsoft.com/office/word/2010/wordprocessingInk" xmlns:wne="http://schemas.microsoft.com/office/word/2006/wordml" xmlns:wps="http://schemas.microsoft.com/office/word/2010/wordprocessingShape" mc:Ignorable="w14 w15 w16se w16cid w16 w16cex w16sdtdh w16sdtfl w16du wp14">
   <w:abstractNum w:abstractNumId="0" w15:restartNumberingAfterBreak="0">
-    <w:nsid w:val="39250471"/>
+    <w:nsid w:val="27110247"/>
     <w:multiLevelType w:val="multilevel"/>
-    <w:tmpl w:val="0832CAFE"/>
+    <w:tmpl w:val="FDEA7C64"/>
     <w:lvl w:ilvl="0">
       <w:start w:val="1"/>
       <w:numFmt w:val="bullet"/>
@@ -1878,9 +1767,9 @@
     </w:lvl>
   </w:abstractNum>
   <w:abstractNum w:abstractNumId="1" w15:restartNumberingAfterBreak="0">
-    <w:nsid w:val="3BE03C6D"/>
+    <w:nsid w:val="31F00D40"/>
     <w:multiLevelType w:val="multilevel"/>
-    <w:tmpl w:val="C9AEBF2A"/>
+    <w:tmpl w:val="F76EB9D0"/>
     <w:lvl w:ilvl="0">
       <w:start w:val="1"/>
       <w:numFmt w:val="bullet"/>
@@ -2027,9 +1916,9 @@
     </w:lvl>
   </w:abstractNum>
   <w:abstractNum w:abstractNumId="2" w15:restartNumberingAfterBreak="0">
-    <w:nsid w:val="45E533AB"/>
+    <w:nsid w:val="47BC2F02"/>
     <w:multiLevelType w:val="multilevel"/>
-    <w:tmpl w:val="B254C610"/>
+    <w:tmpl w:val="247C0018"/>
     <w:lvl w:ilvl="0">
       <w:start w:val="1"/>
       <w:numFmt w:val="bullet"/>
@@ -2176,9 +2065,9 @@
     </w:lvl>
   </w:abstractNum>
   <w:abstractNum w:abstractNumId="3" w15:restartNumberingAfterBreak="0">
-    <w:nsid w:val="4B303199"/>
+    <w:nsid w:val="4CEC2E28"/>
     <w:multiLevelType w:val="multilevel"/>
-    <w:tmpl w:val="F9FCBDCA"/>
+    <w:tmpl w:val="BBC054BA"/>
     <w:lvl w:ilvl="0">
       <w:start w:val="1"/>
       <w:numFmt w:val="bullet"/>
@@ -2325,9 +2214,9 @@
     </w:lvl>
   </w:abstractNum>
   <w:abstractNum w:abstractNumId="4" w15:restartNumberingAfterBreak="0">
-    <w:nsid w:val="4E3B718A"/>
+    <w:nsid w:val="53831C3D"/>
     <w:multiLevelType w:val="multilevel"/>
-    <w:tmpl w:val="F35EEDC2"/>
+    <w:tmpl w:val="F6BC1216"/>
     <w:lvl w:ilvl="0">
       <w:start w:val="1"/>
       <w:numFmt w:val="bullet"/>
@@ -2474,9 +2363,9 @@
     </w:lvl>
   </w:abstractNum>
   <w:abstractNum w:abstractNumId="5" w15:restartNumberingAfterBreak="0">
-    <w:nsid w:val="7396099E"/>
+    <w:nsid w:val="5B5058C2"/>
     <w:multiLevelType w:val="multilevel"/>
-    <w:tmpl w:val="5630C3C6"/>
+    <w:tmpl w:val="833CF50E"/>
     <w:lvl w:ilvl="0">
       <w:start w:val="1"/>
       <w:numFmt w:val="bullet"/>
@@ -2623,9 +2512,9 @@
     </w:lvl>
   </w:abstractNum>
   <w:abstractNum w:abstractNumId="6" w15:restartNumberingAfterBreak="0">
-    <w:nsid w:val="7FE95089"/>
+    <w:nsid w:val="5EF1154D"/>
     <w:multiLevelType w:val="multilevel"/>
-    <w:tmpl w:val="98428A82"/>
+    <w:tmpl w:val="AE7663A2"/>
     <w:lvl w:ilvl="0">
       <w:start w:val="1"/>
       <w:numFmt w:val="bullet"/>
@@ -2771,32 +2660,184 @@
       </w:rPr>
     </w:lvl>
   </w:abstractNum>
-  <w:num w:numId="1">
+  <w:abstractNum w:abstractNumId="7" w15:restartNumberingAfterBreak="0">
+    <w:nsid w:val="761D79E6"/>
+    <w:multiLevelType w:val="multilevel"/>
+    <w:tmpl w:val="8A78B8DA"/>
+    <w:lvl w:ilvl="0">
+      <w:start w:val="1"/>
+      <w:numFmt w:val="bullet"/>
+      <w:lvlText w:val=""/>
+      <w:lvlJc w:val="left"/>
+      <w:pPr>
+        <w:tabs>
+          <w:tab w:val="num" w:pos="720"/>
+        </w:tabs>
+        <w:ind w:left="720" w:hanging="360"/>
+      </w:pPr>
+      <w:rPr>
+        <w:rFonts w:ascii="Symbol" w:hAnsi="Symbol" w:hint="default"/>
+        <w:sz w:val="20"/>
+      </w:rPr>
+    </w:lvl>
+    <w:lvl w:ilvl="1" w:tentative="1">
+      <w:start w:val="1"/>
+      <w:numFmt w:val="bullet"/>
+      <w:lvlText w:val="o"/>
+      <w:lvlJc w:val="left"/>
+      <w:pPr>
+        <w:tabs>
+          <w:tab w:val="num" w:pos="1440"/>
+        </w:tabs>
+        <w:ind w:left="1440" w:hanging="360"/>
+      </w:pPr>
+      <w:rPr>
+        <w:rFonts w:ascii="Courier New" w:hAnsi="Courier New" w:hint="default"/>
+        <w:sz w:val="20"/>
+      </w:rPr>
+    </w:lvl>
+    <w:lvl w:ilvl="2" w:tentative="1">
+      <w:start w:val="1"/>
+      <w:numFmt w:val="bullet"/>
+      <w:lvlText w:val=""/>
+      <w:lvlJc w:val="left"/>
+      <w:pPr>
+        <w:tabs>
+          <w:tab w:val="num" w:pos="2160"/>
+        </w:tabs>
+        <w:ind w:left="2160" w:hanging="360"/>
+      </w:pPr>
+      <w:rPr>
+        <w:rFonts w:ascii="Wingdings" w:hAnsi="Wingdings" w:hint="default"/>
+        <w:sz w:val="20"/>
+      </w:rPr>
+    </w:lvl>
+    <w:lvl w:ilvl="3" w:tentative="1">
+      <w:start w:val="1"/>
+      <w:numFmt w:val="bullet"/>
+      <w:lvlText w:val=""/>
+      <w:lvlJc w:val="left"/>
+      <w:pPr>
+        <w:tabs>
+          <w:tab w:val="num" w:pos="2880"/>
+        </w:tabs>
+        <w:ind w:left="2880" w:hanging="360"/>
+      </w:pPr>
+      <w:rPr>
+        <w:rFonts w:ascii="Wingdings" w:hAnsi="Wingdings" w:hint="default"/>
+        <w:sz w:val="20"/>
+      </w:rPr>
+    </w:lvl>
+    <w:lvl w:ilvl="4" w:tentative="1">
+      <w:start w:val="1"/>
+      <w:numFmt w:val="bullet"/>
+      <w:lvlText w:val=""/>
+      <w:lvlJc w:val="left"/>
+      <w:pPr>
+        <w:tabs>
+          <w:tab w:val="num" w:pos="3600"/>
+        </w:tabs>
+        <w:ind w:left="3600" w:hanging="360"/>
+      </w:pPr>
+      <w:rPr>
+        <w:rFonts w:ascii="Wingdings" w:hAnsi="Wingdings" w:hint="default"/>
+        <w:sz w:val="20"/>
+      </w:rPr>
+    </w:lvl>
+    <w:lvl w:ilvl="5" w:tentative="1">
+      <w:start w:val="1"/>
+      <w:numFmt w:val="bullet"/>
+      <w:lvlText w:val=""/>
+      <w:lvlJc w:val="left"/>
+      <w:pPr>
+        <w:tabs>
+          <w:tab w:val="num" w:pos="4320"/>
+        </w:tabs>
+        <w:ind w:left="4320" w:hanging="360"/>
+      </w:pPr>
+      <w:rPr>
+        <w:rFonts w:ascii="Wingdings" w:hAnsi="Wingdings" w:hint="default"/>
+        <w:sz w:val="20"/>
+      </w:rPr>
+    </w:lvl>
+    <w:lvl w:ilvl="6" w:tentative="1">
+      <w:start w:val="1"/>
+      <w:numFmt w:val="bullet"/>
+      <w:lvlText w:val=""/>
+      <w:lvlJc w:val="left"/>
+      <w:pPr>
+        <w:tabs>
+          <w:tab w:val="num" w:pos="5040"/>
+        </w:tabs>
+        <w:ind w:left="5040" w:hanging="360"/>
+      </w:pPr>
+      <w:rPr>
+        <w:rFonts w:ascii="Wingdings" w:hAnsi="Wingdings" w:hint="default"/>
+        <w:sz w:val="20"/>
+      </w:rPr>
+    </w:lvl>
+    <w:lvl w:ilvl="7" w:tentative="1">
+      <w:start w:val="1"/>
+      <w:numFmt w:val="bullet"/>
+      <w:lvlText w:val=""/>
+      <w:lvlJc w:val="left"/>
+      <w:pPr>
+        <w:tabs>
+          <w:tab w:val="num" w:pos="5760"/>
+        </w:tabs>
+        <w:ind w:left="5760" w:hanging="360"/>
+      </w:pPr>
+      <w:rPr>
+        <w:rFonts w:ascii="Wingdings" w:hAnsi="Wingdings" w:hint="default"/>
+        <w:sz w:val="20"/>
+      </w:rPr>
+    </w:lvl>
+    <w:lvl w:ilvl="8" w:tentative="1">
+      <w:start w:val="1"/>
+      <w:numFmt w:val="bullet"/>
+      <w:lvlText w:val=""/>
+      <w:lvlJc w:val="left"/>
+      <w:pPr>
+        <w:tabs>
+          <w:tab w:val="num" w:pos="6480"/>
+        </w:tabs>
+        <w:ind w:left="6480" w:hanging="360"/>
+      </w:pPr>
+      <w:rPr>
+        <w:rFonts w:ascii="Wingdings" w:hAnsi="Wingdings" w:hint="default"/>
+        <w:sz w:val="20"/>
+      </w:rPr>
+    </w:lvl>
+  </w:abstractNum>
+  <w:num w:numId="1" w16cid:durableId="1781298867">
+    <w:abstractNumId w:val="6"/>
+  </w:num>
+  <w:num w:numId="2" w16cid:durableId="194198738">
+    <w:abstractNumId w:val="2"/>
+  </w:num>
+  <w:num w:numId="3" w16cid:durableId="1909918075">
     <w:abstractNumId w:val="1"/>
   </w:num>
-  <w:num w:numId="2">
-    <w:abstractNumId w:val="0"/>
+  <w:num w:numId="4" w16cid:durableId="300042886">
+    <w:abstractNumId w:val="4"/>
   </w:num>
-  <w:num w:numId="3">
-    <w:abstractNumId w:val="6"/>
+  <w:num w:numId="5" w16cid:durableId="1336880497">
+    <w:abstractNumId w:val="5"/>
   </w:num>
-  <w:num w:numId="4">
-    <w:abstractNumId w:val="2"/>
-  </w:num>
-  <w:num w:numId="5">
+  <w:num w:numId="6" w16cid:durableId="2054380917">
     <w:abstractNumId w:val="3"/>
   </w:num>
-  <w:num w:numId="6">
-    <w:abstractNumId w:val="5"/>
+  <w:num w:numId="7" w16cid:durableId="410467035">
+    <w:abstractNumId w:val="7"/>
   </w:num>
-  <w:num w:numId="7">
-    <w:abstractNumId w:val="4"/>
+  <w:num w:numId="8" w16cid:durableId="1144159979">
+    <w:abstractNumId w:val="0"/>
   </w:num>
 </w:numbering>
 </file>
 
 <file path=word/styles.xml><?xml version="1.0" encoding="utf-8"?>
-<w:styles xmlns:mc="http://schemas.openxmlformats.org/markup-compatibility/2006" xmlns:r="http://schemas.openxmlformats.org/officeDocument/2006/relationships" xmlns:w="http://schemas.openxmlformats.org/wordprocessingml/2006/main" xmlns:w14="http://schemas.microsoft.com/office/word/2010/wordml" xmlns:w15="http://schemas.microsoft.com/office/word/2012/wordml" xmlns:w16cex="http://schemas.microsoft.com/office/word/2018/wordml/cex" xmlns:w16cid="http://schemas.microsoft.com/office/word/2016/wordml/cid" xmlns:w16="http://schemas.microsoft.com/office/word/2018/wordml" xmlns:w16sdtdh="http://schemas.microsoft.com/office/word/2020/wordml/sdtdatahash" xmlns:w16se="http://schemas.microsoft.com/office/word/2015/wordml/symex" mc:Ignorable="w14 w15 w16se w16cid w16 w16cex w16sdtdh">
+<w:styles xmlns:mc="http://schemas.openxmlformats.org/markup-compatibility/2006" xmlns:r="http://schemas.openxmlformats.org/officeDocument/2006/relationships" xmlns:w="http://schemas.openxmlformats.org/wordprocessingml/2006/main" xmlns:w14="http://schemas.microsoft.com/office/word/2010/wordml" xmlns:w15="http://schemas.microsoft.com/office/word/2012/wordml" xmlns:w16cex="http://schemas.microsoft.com/office/word/2018/wordml/cex" xmlns:w16cid="http://schemas.microsoft.com/office/word/2016/wordml/cid" xmlns:w16="http://schemas.microsoft.com/office/word/2018/wordml" xmlns:w16du="http://schemas.microsoft.com/office/word/2023/wordml/word16du" xmlns:w16sdtdh="http://schemas.microsoft.com/office/word/2020/wordml/sdtdatahash" xmlns:w16sdtfl="http://schemas.microsoft.com/office/word/2024/wordml/sdtformatlock" xmlns:w16se="http://schemas.microsoft.com/office/word/2015/wordml/symex" mc:Ignorable="w14 w15 w16se w16cid w16 w16cex w16sdtdh w16sdtfl w16du">
   <w:docDefaults>
     <w:rPrDefault>
       <w:rPr>
@@ -3298,8 +3339,8 @@
     <w:rPr>
       <w:rFonts w:asciiTheme="majorHAnsi" w:eastAsiaTheme="majorEastAsia" w:hAnsiTheme="majorHAnsi" w:cstheme="majorBidi"/>
       <w:color w:val="2F5496" w:themeColor="accent1" w:themeShade="BF"/>
-      <w:sz w:val="32"/>
-      <w:szCs w:val="32"/>
+      <w:sz w:val="40"/>
+      <w:szCs w:val="40"/>
     </w:rPr>
   </w:style>
   <w:style w:type="character" w:customStyle="1" w:styleId="Heading2Char">
@@ -3311,8 +3352,8 @@
     <w:rPr>
       <w:rFonts w:asciiTheme="majorHAnsi" w:eastAsiaTheme="majorEastAsia" w:hAnsiTheme="majorHAnsi" w:cstheme="majorBidi"/>
       <w:color w:val="2F5496" w:themeColor="accent1" w:themeShade="BF"/>
-      <w:sz w:val="26"/>
-      <w:szCs w:val="26"/>
+      <w:sz w:val="32"/>
+      <w:szCs w:val="32"/>
     </w:rPr>
   </w:style>
   <w:style w:type="paragraph" w:customStyle="1" w:styleId="msonormal0">

</xml_diff>